<commit_message>
Word and Excel: review findings - drop cap placement, counters per numId, 1904 serial zero
- A drop cap goes to the very next block (heading, list item, text); with nothing to join (empty paragraph, contents entry, code, table, end of document) it stands as its own paragraph.
- Ordered-list counters are kept per numbering instance (numId), as paragraphs with the same numId carry on across paragraphs in between.
- The 1904 offset applies to serial zero too (1904-01-01).
- word-notes gets a drop cap before a heading and one at the end; a behaviour test covers the 1904 workbook (they fail on the previous code).

Co-Authored-By: Claude Sonnet 5.5 <noreply@anthropic.com>
</commit_message>
<xml_diff>
--- a/Dev/Caret.ConverterTests/samples/word-notes.docx
+++ b/Dev/Caret.ConverterTests/samples/word-notes.docx
@@ -212,8 +212,32 @@
       </w:r>
     </w:p>
     <w:p>
+      <w:pPr>
+        <w:framePr w:dropCap="drop" w:lines="3"/>
+      </w:pPr>
+      <w:r>
+        <w:t>L</w:t>
+      </w:r>
+    </w:p>
+    <w:p>
+      <w:pPr>
+        <w:pStyle w:val="Heading2"/>
+      </w:pPr>
+      <w:r>
+        <w:t xml:space="preserve">ast section</w:t>
+      </w:r>
+    </w:p>
+    <w:p>
       <w:r>
         <w:t xml:space="preserve">End.</w:t>
+      </w:r>
+    </w:p>
+    <w:p>
+      <w:pPr>
+        <w:framePr w:dropCap="drop" w:lines="3"/>
+      </w:pPr>
+      <w:r>
+        <w:t>Q</w:t>
       </w:r>
     </w:p>
   </w:body>

</xml_diff>

<commit_message>
Word: review findings - counter slot by effective level, emphasis and link kept on a script fallback
- An ordered item put one level deeper by its style (List Number 2) counts at that level, not at the level its numbering says.
- A superscript or subscript that has no Unicode form keeps the run's bold, italic, strike and link (the emphasis sits inside the <sup>/<sub> tags).
- word-notes covers both (they fail on the previous code).

Co-Authored-By: Claude Sonnet 5.5 <noreply@anthropic.com>
</commit_message>
<xml_diff>
--- a/Dev/Caret.ConverterTests/samples/word-notes.docx
+++ b/Dev/Caret.ConverterTests/samples/word-notes.docx
@@ -47,9 +47,10 @@
       </w:r>
       <w:r>
         <w:rPr>
+          <w:b/>
           <w:vertAlign w:val="superscript"/>
         </w:rPr>
-        <w:t xml:space="preserve">-9 per day</w:t>
+        <w:t>-9 per day</w:t>
       </w:r>
       <w:r>
         <w:t xml:space="preserve">. A note</w:t>
@@ -89,6 +90,18 @@
       </w:pPr>
       <w:r>
         <w:t xml:space="preserve">Two</w:t>
+      </w:r>
+    </w:p>
+    <w:p>
+      <w:pPr>
+        <w:pStyle w:val="ListNumber2"/>
+        <w:numPr>
+          <w:ilvl w:val="0"/>
+          <w:numId w:val="2"/>
+        </w:numPr>
+      </w:pPr>
+      <w:r>
+        <w:t xml:space="preserve">A sub-item through the List Number 2 style</w:t>
       </w:r>
     </w:p>
     <w:p>
@@ -288,6 +301,11 @@
       <w:numFmt w:val="decimal"/>
       <w:lvlText w:val="%1."/>
     </w:lvl>
+    <w:lvl w:ilvl="1">
+      <w:start w:val="1"/>
+      <w:numFmt w:val="decimal"/>
+      <w:lvlText w:val="%2."/>
+    </w:lvl>
   </w:abstractNum>
   <w:num w:numId="1">
     <w:abstractNumId w:val="0"/>
@@ -306,6 +324,9 @@
   <w:style w:type="paragraph" w:styleId="Heading2">
     <w:name w:val="heading 2"/>
   </w:style>
+  <w:style w:type="paragraph" w:styleId="ListNumber2">
+    <w:name w:val="List Number 2"/>
+  </w:style>
   <w:style w:type="paragraph" w:styleId="ListParagraph">
     <w:name w:val="List Paragraph"/>
   </w:style>

</xml_diff>